<commit_message>
Use the college title page in the practice report
</commit_message>
<xml_diff>
--- a/docs/report/Отчёт по практике — Панов Д. С.docx
+++ b/docs/report/Отчёт по практике — Панов Д. С.docx
@@ -4,265 +4,497 @@
   <w:body>
     <w:p>
       <w:pPr>
-        <w:spacing w:after="0" w:before="0" w:line="276"/>
+        <w:spacing w:after="160" w:line="360" w:lineRule="auto"/>
         <w:jc w:val="center"/>
-      </w:pPr>
-      <w:r>
-        <w:rPr>
+        <w:rPr>
+          <w:rFonts w:ascii="Times New Roman" w:eastAsia="Calibri" w:hAnsi="Times New Roman" w:cs="Times New Roman"/>
           <w:sz w:val="28"/>
           <w:szCs w:val="28"/>
-          <w:highlight w:val="yellow"/>
-        </w:rPr>
-        <w:t xml:space="preserve">[Министерство образования …]</w:t>
-      </w:r>
-    </w:p>
-    <w:p>
-      <w:pPr>
-        <w:spacing w:after="120" w:before="0" w:line="276"/>
-        <w:jc w:val="center"/>
-      </w:pPr>
-      <w:r>
-        <w:rPr>
+        </w:rPr>
+      </w:pPr>
+      <w:r>
+        <w:rPr>
+          <w:rFonts w:ascii="Times New Roman" w:eastAsia="Calibri" w:hAnsi="Times New Roman" w:cs="Times New Roman"/>
           <w:sz w:val="28"/>
           <w:szCs w:val="28"/>
-          <w:highlight w:val="yellow"/>
-        </w:rPr>
-        <w:t xml:space="preserve">[Полное наименование образовательной организации]</w:t>
-      </w:r>
-    </w:p>
-    <w:p>
-      <w:pPr>
-        <w:spacing w:after="0" w:before="240" w:line="276"/>
+        </w:rPr>
+        <w:t>Министерство образования Новосибирской области</w:t>
+      </w:r>
+    </w:p>
+    <w:p>
+      <w:pPr>
+        <w:spacing w:after="160" w:line="360" w:lineRule="auto"/>
         <w:jc w:val="center"/>
-      </w:pPr>
-      <w:r>
-        <w:rPr>
+        <w:rPr>
+          <w:rFonts w:ascii="Times New Roman" w:eastAsia="Calibri" w:hAnsi="Times New Roman" w:cs="Times New Roman"/>
           <w:sz w:val="28"/>
           <w:szCs w:val="28"/>
         </w:rPr>
-        <w:t xml:space="preserve">Специальность 09.02.07 «Информационные системы и программирование»</w:t>
-      </w:r>
-    </w:p>
-    <w:p>
-      <w:pPr>
-        <w:spacing w:after="0" w:before="1800" w:line="276"/>
-        <w:jc w:val="center"/>
-      </w:pPr>
-      <w:r>
-        <w:rPr>
-          <w:b/>
-          <w:bCs/>
-          <w:sz w:val="32"/>
-          <w:szCs w:val="32"/>
-        </w:rPr>
-        <w:t xml:space="preserve">ОТЧЁТ</w:t>
-      </w:r>
-    </w:p>
-    <w:p>
-      <w:pPr>
-        <w:spacing w:after="0" w:before="120" w:line="276"/>
-        <w:jc w:val="center"/>
-      </w:pPr>
-      <w:r>
-        <w:rPr>
+      </w:pPr>
+      <w:r>
+        <w:rPr>
+          <w:rFonts w:ascii="Times New Roman" w:eastAsia="Calibri" w:hAnsi="Times New Roman" w:cs="Times New Roman"/>
           <w:sz w:val="28"/>
           <w:szCs w:val="28"/>
         </w:rPr>
-        <w:t xml:space="preserve">по </w:t>
-      </w:r>
-      <w:r>
-        <w:rPr>
+        <w:t>Государственное бюджетное профессиональное образовательное учреждение Новосибирской области</w:t>
+      </w:r>
+    </w:p>
+    <w:p>
+      <w:pPr>
+        <w:spacing w:after="160" w:line="360" w:lineRule="auto"/>
+        <w:jc w:val="center"/>
+        <w:rPr>
+          <w:rFonts w:ascii="Times New Roman" w:eastAsia="Calibri" w:hAnsi="Times New Roman" w:cs="Times New Roman"/>
           <w:sz w:val="28"/>
           <w:szCs w:val="28"/>
-          <w:highlight w:val="yellow"/>
-        </w:rPr>
-        <w:t xml:space="preserve">[учебной / производственной]</w:t>
-      </w:r>
-      <w:r>
-        <w:rPr>
+        </w:rPr>
+      </w:pPr>
+      <w:r>
+        <w:rPr>
+          <w:rFonts w:ascii="Times New Roman" w:eastAsia="Calibri" w:hAnsi="Times New Roman" w:cs="Times New Roman"/>
           <w:sz w:val="28"/>
           <w:szCs w:val="28"/>
         </w:rPr>
-        <w:t xml:space="preserve"> практике</w:t>
-      </w:r>
-    </w:p>
-    <w:p>
-      <w:pPr>
-        <w:spacing w:after="0" w:before="0" w:line="276"/>
+        <w:t>«Новосибирский колледж электроники и вычислительной техники»</w:t>
+      </w:r>
+    </w:p>
+    <w:p>
+      <w:pPr>
+        <w:spacing w:after="160" w:line="360" w:lineRule="auto"/>
         <w:jc w:val="center"/>
-      </w:pPr>
-      <w:r>
-        <w:rPr>
+        <w:rPr>
+          <w:rFonts w:ascii="Times New Roman" w:eastAsia="Calibri" w:hAnsi="Times New Roman" w:cs="Times New Roman"/>
           <w:sz w:val="28"/>
           <w:szCs w:val="28"/>
         </w:rPr>
-        <w:t xml:space="preserve">ПМ.</w:t>
-      </w:r>
-      <w:r>
-        <w:rPr>
+      </w:pPr>
+      <w:r>
+        <w:rPr>
+          <w:rFonts w:ascii="Times New Roman" w:eastAsia="Calibri" w:hAnsi="Times New Roman" w:cs="Times New Roman"/>
           <w:sz w:val="28"/>
           <w:szCs w:val="28"/>
-          <w:highlight w:val="yellow"/>
-        </w:rPr>
-        <w:t xml:space="preserve">[__]</w:t>
-      </w:r>
-      <w:r>
-        <w:rPr>
+        </w:rPr>
+        <w:t>(ГБПОУ НСО «Новосибирский колледж электроники и вычислительной техники»)</w:t>
+      </w:r>
+    </w:p>
+    <w:p>
+      <w:pPr>
+        <w:spacing w:after="160" w:line="259" w:lineRule="auto"/>
+        <w:jc w:val="center"/>
+        <w:rPr>
+          <w:rFonts w:eastAsia="Calibri"/>
+          <w:b/>
+          <w:color w:val="FF0000"/>
           <w:sz w:val="28"/>
           <w:szCs w:val="28"/>
         </w:rPr>
-        <w:t xml:space="preserve"> «</w:t>
-      </w:r>
-      <w:r>
-        <w:rPr>
+      </w:pPr>
+    </w:p>
+    <w:p>
+      <w:pPr>
+        <w:spacing w:after="160" w:line="256" w:lineRule="auto"/>
+        <w:rPr>
+          <w:rFonts w:eastAsia="Calibri"/>
           <w:sz w:val="28"/>
           <w:szCs w:val="28"/>
-          <w:highlight w:val="yellow"/>
-        </w:rPr>
-        <w:t xml:space="preserve">[наименование профессионального модуля]</w:t>
-      </w:r>
-      <w:r>
-        <w:rPr>
+        </w:rPr>
+      </w:pPr>
+    </w:p>
+    <w:p>
+      <w:pPr>
+        <w:spacing w:after="160" w:line="256" w:lineRule="auto"/>
+        <w:rPr>
+          <w:rFonts w:eastAsia="Calibri"/>
           <w:sz w:val="28"/>
           <w:szCs w:val="28"/>
         </w:rPr>
-        <w:t xml:space="preserve">»</w:t>
-      </w:r>
-    </w:p>
-    <w:p>
-      <w:pPr>
-        <w:spacing w:after="0" w:before="360" w:line="276"/>
-        <w:jc w:val="center"/>
-      </w:pPr>
-      <w:r>
-        <w:rPr>
-          <w:b/>
-          <w:bCs/>
+      </w:pPr>
+    </w:p>
+    <w:p>
+      <w:pPr>
+        <w:spacing w:after="160" w:line="256" w:lineRule="auto"/>
+        <w:rPr>
+          <w:rFonts w:eastAsia="Calibri"/>
           <w:sz w:val="28"/>
           <w:szCs w:val="28"/>
         </w:rPr>
-        <w:t xml:space="preserve">Тема: «Разработка веб-приложения "Ремонтная мастерская"»</w:t>
-      </w:r>
-    </w:p>
-    <w:p>
-      <w:pPr>
-        <w:spacing w:after="0" w:before="1800" w:line="276"/>
-        <w:ind w:left="4536"/>
-        <w:jc w:val="left"/>
-      </w:pPr>
-      <w:r>
-        <w:rPr>
+      </w:pPr>
+    </w:p>
+    <w:p>
+      <w:pPr>
+        <w:spacing w:after="160" w:line="259" w:lineRule="auto"/>
+        <w:rPr>
+          <w:rFonts w:eastAsia="Calibri"/>
           <w:sz w:val="28"/>
           <w:szCs w:val="28"/>
         </w:rPr>
-        <w:t xml:space="preserve">Выполнил студент группы 9ИС-360</w:t>
-      </w:r>
-    </w:p>
-    <w:p>
-      <w:pPr>
-        <w:spacing w:after="0" w:before="120" w:line="276"/>
-        <w:ind w:left="4536"/>
-        <w:jc w:val="left"/>
-      </w:pPr>
-      <w:r>
-        <w:rPr>
+      </w:pPr>
+    </w:p>
+    <w:p>
+      <w:pPr>
+        <w:spacing w:after="160" w:line="259" w:lineRule="auto"/>
+        <w:jc w:val="center"/>
+        <w:rPr>
+          <w:rFonts w:ascii="Times New Roman" w:eastAsia="Calibri" w:hAnsi="Times New Roman" w:cs="Times New Roman"/>
           <w:sz w:val="28"/>
           <w:szCs w:val="28"/>
         </w:rPr>
-        <w:t xml:space="preserve">Панов Д. С. ____________</w:t>
-      </w:r>
-    </w:p>
-    <w:p>
-      <w:pPr>
-        <w:spacing w:after="0" w:before="360" w:line="276"/>
-        <w:ind w:left="4536"/>
-        <w:jc w:val="left"/>
-      </w:pPr>
-      <w:r>
-        <w:rPr>
+      </w:pPr>
+      <w:r>
+        <w:rPr>
+          <w:rFonts w:ascii="Times New Roman" w:eastAsia="Calibri" w:hAnsi="Times New Roman" w:cs="Times New Roman"/>
           <w:sz w:val="28"/>
           <w:szCs w:val="28"/>
         </w:rPr>
-        <w:t xml:space="preserve">Руководитель практики</w:t>
-      </w:r>
-    </w:p>
-    <w:p>
-      <w:pPr>
-        <w:spacing w:after="0" w:before="120" w:line="276"/>
-        <w:ind w:left="4536"/>
-        <w:jc w:val="left"/>
-      </w:pPr>
-      <w:r>
-        <w:rPr>
+        <w:t>Отчет по учебной практике</w:t>
+      </w:r>
+    </w:p>
+    <w:p>
+      <w:pPr>
+        <w:spacing w:after="160" w:line="259" w:lineRule="auto"/>
+        <w:rPr>
+          <w:rFonts w:ascii="Times New Roman" w:eastAsia="Calibri" w:hAnsi="Times New Roman" w:cs="Times New Roman"/>
           <w:sz w:val="28"/>
           <w:szCs w:val="28"/>
-          <w:highlight w:val="yellow"/>
-        </w:rPr>
-        <w:t xml:space="preserve">[Фамилия И. О.]</w:t>
-      </w:r>
-      <w:r>
-        <w:rPr>
+        </w:rPr>
+      </w:pPr>
+      <w:r>
+        <w:rPr>
+          <w:rFonts w:ascii="Times New Roman" w:eastAsia="Calibri" w:hAnsi="Times New Roman" w:cs="Times New Roman"/>
           <w:sz w:val="28"/>
           <w:szCs w:val="28"/>
         </w:rPr>
-        <w:t xml:space="preserve"> ____________</w:t>
-      </w:r>
-    </w:p>
-    <w:p>
-      <w:pPr>
-        <w:spacing w:after="0" w:before="360" w:line="276"/>
-        <w:ind w:left="4536"/>
-        <w:jc w:val="left"/>
-      </w:pPr>
-      <w:r>
-        <w:rPr>
+        <w:t>Специальность   09.02.07 «Информационные системы и программирование»</w:t>
+      </w:r>
+    </w:p>
+    <w:p>
+      <w:pPr>
+        <w:spacing w:after="160" w:line="259" w:lineRule="auto"/>
+        <w:rPr>
+          <w:rFonts w:ascii="Times New Roman" w:eastAsia="Calibri" w:hAnsi="Times New Roman" w:cs="Times New Roman"/>
+          <w:b/>
           <w:sz w:val="28"/>
           <w:szCs w:val="28"/>
         </w:rPr>
-        <w:t xml:space="preserve">Оценка: ______________</w:t>
-      </w:r>
-    </w:p>
-    <w:p>
-      <w:pPr>
-        <w:spacing w:after="0" w:before="360" w:line="276"/>
-        <w:ind w:left="4536"/>
-        <w:jc w:val="left"/>
-      </w:pPr>
-      <w:r>
-        <w:rPr>
+      </w:pPr>
+      <w:r>
+        <w:rPr>
+          <w:rFonts w:ascii="Times New Roman" w:eastAsia="Calibri" w:hAnsi="Times New Roman" w:cs="Times New Roman"/>
+          <w:b/>
           <w:sz w:val="28"/>
           <w:szCs w:val="28"/>
         </w:rPr>
-        <w:t xml:space="preserve">Сроки практики: </w:t>
-      </w:r>
-      <w:r>
-        <w:rPr>
+        <w:t xml:space="preserve">Тема: </w:t>
+      </w:r>
+      <w:r>
+        <w:rPr>
+          <w:rFonts w:ascii="Times New Roman" w:eastAsia="Calibri" w:hAnsi="Times New Roman" w:cs="Times New Roman"/>
           <w:sz w:val="28"/>
           <w:szCs w:val="28"/>
-          <w:highlight w:val="yellow"/>
-        </w:rPr>
-        <w:t xml:space="preserve">[__.__.2026 – __.__.2026]</w:t>
-      </w:r>
-    </w:p>
-    <w:p>
-      <w:pPr>
-        <w:spacing w:after="0" w:before="1600" w:line="276"/>
+        </w:rPr>
+        <w:t>Разработка веб-приложения «Ремонтная мастерская»</w:t>
+      </w:r>
+    </w:p>
+    <w:tbl>
+      <w:tblPr>
+        <w:tblW w:w="10461" w:type="dxa"/>
         <w:jc w:val="center"/>
-      </w:pPr>
-      <w:r>
-        <w:rPr>
+        <w:tblBorders>
+          <w:top w:val="single" w:sz="4" w:space="0" w:color="auto"/>
+          <w:left w:val="single" w:sz="4" w:space="0" w:color="auto"/>
+          <w:bottom w:val="single" w:sz="4" w:space="0" w:color="auto"/>
+          <w:right w:val="single" w:sz="4" w:space="0" w:color="auto"/>
+          <w:insideH w:val="single" w:sz="4" w:space="0" w:color="auto"/>
+          <w:insideV w:val="single" w:sz="4" w:space="0" w:color="auto"/>
+        </w:tblBorders>
+        <w:tblLook w:val="04A0" w:firstRow="1" w:lastRow="0" w:firstColumn="1" w:lastColumn="0" w:noHBand="0" w:noVBand="1"/>
+      </w:tblPr>
+      <w:tblGrid>
+        <w:gridCol w:w="10461"/>
+      </w:tblGrid>
+      <w:tr>
+        <w:trPr>
+          <w:trHeight w:val="385"/>
+          <w:jc w:val="center"/>
+        </w:trPr>
+        <w:tc>
+          <w:tcPr>
+            <w:tcW w:w="10461" w:type="dxa"/>
+            <w:tcBorders>
+              <w:top w:val="single" w:sz="4" w:space="0" w:color="auto"/>
+              <w:left w:val="nil"/>
+              <w:bottom w:val="nil"/>
+              <w:right w:val="nil"/>
+            </w:tcBorders>
+            <w:hideMark/>
+          </w:tcPr>
+          <w:p>
+            <w:pPr>
+              <w:spacing w:after="160" w:line="259" w:lineRule="auto"/>
+              <w:jc w:val="center"/>
+              <w:rPr>
+                <w:rFonts w:ascii="Times New Roman" w:eastAsia="Calibri" w:hAnsi="Times New Roman" w:cs="Times New Roman"/>
+                <w:sz w:val="28"/>
+                <w:szCs w:val="28"/>
+              </w:rPr>
+            </w:pPr>
+          </w:p>
+        </w:tc>
+      </w:tr>
+      <w:tr>
+        <w:trPr>
+          <w:trHeight w:val="483"/>
+          <w:jc w:val="center"/>
+        </w:trPr>
+        <w:tc>
+          <w:tcPr>
+            <w:tcW w:w="10461" w:type="dxa"/>
+            <w:tcBorders>
+              <w:top w:val="nil"/>
+              <w:left w:val="nil"/>
+              <w:bottom w:val="nil"/>
+              <w:right w:val="nil"/>
+            </w:tcBorders>
+            <w:hideMark/>
+          </w:tcPr>
+          <w:p>
+            <w:pPr>
+              <w:spacing w:after="160" w:line="259" w:lineRule="auto"/>
+              <w:jc w:val="right"/>
+              <w:rPr>
+                <w:rFonts w:ascii="Times New Roman" w:eastAsia="Calibri" w:hAnsi="Times New Roman" w:cs="Times New Roman"/>
+                <w:sz w:val="28"/>
+                <w:szCs w:val="28"/>
+              </w:rPr>
+            </w:pPr>
+          </w:p>
+          <w:p>
+            <w:pPr>
+              <w:spacing w:after="160" w:line="259" w:lineRule="auto"/>
+              <w:jc w:val="right"/>
+              <w:rPr>
+                <w:rFonts w:ascii="Times New Roman" w:eastAsia="Calibri" w:hAnsi="Times New Roman" w:cs="Times New Roman"/>
+                <w:sz w:val="28"/>
+                <w:szCs w:val="28"/>
+              </w:rPr>
+            </w:pPr>
+            <w:r>
+              <w:rPr>
+                <w:rFonts w:ascii="Times New Roman" w:eastAsia="Calibri" w:hAnsi="Times New Roman" w:cs="Times New Roman"/>
+                <w:sz w:val="28"/>
+                <w:szCs w:val="28"/>
+              </w:rPr>
+              <w:t>Выполнил(а) Панов Д. С. ___________</w:t>
+            </w:r>
+          </w:p>
+          <w:p>
+            <w:pPr>
+              <w:spacing w:after="160" w:line="259" w:lineRule="auto"/>
+              <w:jc w:val="right"/>
+              <w:rPr>
+                <w:rFonts w:ascii="Times New Roman" w:eastAsia="Calibri" w:hAnsi="Times New Roman" w:cs="Times New Roman"/>
+                <w:sz w:val="28"/>
+                <w:szCs w:val="28"/>
+              </w:rPr>
+            </w:pPr>
+            <w:r>
+              <w:rPr>
+                <w:rFonts w:ascii="Times New Roman" w:eastAsia="Calibri" w:hAnsi="Times New Roman" w:cs="Times New Roman"/>
+                <w:sz w:val="28"/>
+                <w:szCs w:val="28"/>
+              </w:rPr>
+              <w:t xml:space="preserve">Группа 9ИС-360</w:t>
+            </w:r>
+          </w:p>
+        </w:tc>
+      </w:tr>
+      <w:tr>
+        <w:trPr>
+          <w:trHeight w:val="385"/>
+          <w:jc w:val="center"/>
+        </w:trPr>
+        <w:tc>
+          <w:tcPr>
+            <w:tcW w:w="10461" w:type="dxa"/>
+            <w:tcBorders>
+              <w:top w:val="nil"/>
+              <w:left w:val="nil"/>
+              <w:bottom w:val="nil"/>
+              <w:right w:val="nil"/>
+            </w:tcBorders>
+            <w:hideMark/>
+          </w:tcPr>
+          <w:p>
+            <w:pPr>
+              <w:spacing w:after="160" w:line="259" w:lineRule="auto"/>
+              <w:jc w:val="right"/>
+              <w:rPr>
+                <w:rFonts w:ascii="Times New Roman" w:eastAsia="Calibri" w:hAnsi="Times New Roman" w:cs="Times New Roman"/>
+                <w:sz w:val="28"/>
+                <w:szCs w:val="28"/>
+              </w:rPr>
+            </w:pPr>
+            <w:r>
+              <w:rPr>
+                <w:rFonts w:ascii="Times New Roman" w:eastAsia="Calibri" w:hAnsi="Times New Roman" w:cs="Times New Roman"/>
+                <w:sz w:val="28"/>
+                <w:szCs w:val="28"/>
+              </w:rPr>
+              <w:t>Проверил</w:t>
+            </w:r>
+            <w:r>
+              <w:rPr>
+                <w:rFonts w:ascii="Times New Roman" w:eastAsia="Calibri" w:hAnsi="Times New Roman" w:cs="Times New Roman"/>
+                <w:sz w:val="28"/>
+                <w:szCs w:val="28"/>
+              </w:rPr>
+              <w:t xml:space="preserve">а </w:t>
+            </w:r>
+            <w:r>
+              <w:rPr>
+                <w:rFonts w:ascii="Times New Roman" w:eastAsia="Calibri" w:hAnsi="Times New Roman" w:cs="Times New Roman"/>
+                <w:sz w:val="28"/>
+                <w:szCs w:val="28"/>
+              </w:rPr>
+              <w:t>Балаева</w:t>
+            </w:r>
+            <w:r>
+              <w:rPr>
+                <w:rFonts w:ascii="Times New Roman" w:eastAsia="Calibri" w:hAnsi="Times New Roman" w:cs="Times New Roman"/>
+                <w:sz w:val="28"/>
+                <w:szCs w:val="28"/>
+              </w:rPr>
+              <w:t xml:space="preserve"> Е.М.</w:t>
+            </w:r>
+            <w:r>
+              <w:rPr>
+                <w:rFonts w:ascii="Times New Roman" w:eastAsia="Calibri" w:hAnsi="Times New Roman" w:cs="Times New Roman"/>
+                <w:sz w:val="28"/>
+                <w:szCs w:val="28"/>
+              </w:rPr>
+              <w:t xml:space="preserve"> </w:t>
+            </w:r>
+          </w:p>
+          <w:p>
+            <w:pPr>
+              <w:spacing w:after="160" w:line="259" w:lineRule="auto"/>
+              <w:jc w:val="right"/>
+              <w:rPr>
+                <w:rFonts w:ascii="Times New Roman" w:eastAsia="Calibri" w:hAnsi="Times New Roman" w:cs="Times New Roman"/>
+                <w:sz w:val="28"/>
+                <w:szCs w:val="28"/>
+              </w:rPr>
+            </w:pPr>
+            <w:r>
+              <w:rPr>
+                <w:rFonts w:ascii="Times New Roman" w:eastAsia="Calibri" w:hAnsi="Times New Roman" w:cs="Times New Roman"/>
+                <w:sz w:val="28"/>
+                <w:szCs w:val="28"/>
+              </w:rPr>
+              <w:t>_____________________</w:t>
+            </w:r>
+          </w:p>
+          <w:p>
+            <w:pPr>
+              <w:spacing w:after="160" w:line="259" w:lineRule="auto"/>
+              <w:jc w:val="right"/>
+              <w:rPr>
+                <w:rFonts w:ascii="Times New Roman" w:eastAsia="Calibri" w:hAnsi="Times New Roman" w:cs="Times New Roman"/>
+                <w:sz w:val="28"/>
+                <w:szCs w:val="28"/>
+              </w:rPr>
+            </w:pPr>
+            <w:r>
+              <w:rPr>
+                <w:rFonts w:ascii="Times New Roman" w:eastAsia="Calibri" w:hAnsi="Times New Roman" w:cs="Times New Roman"/>
+                <w:sz w:val="28"/>
+                <w:szCs w:val="28"/>
+              </w:rPr>
+              <w:t>Оценка______________</w:t>
+            </w:r>
+          </w:p>
+        </w:tc>
+      </w:tr>
+    </w:tbl>
+    <w:p>
+      <w:pPr>
+        <w:spacing w:after="160" w:line="259" w:lineRule="auto"/>
+        <w:rPr>
+          <w:rFonts w:ascii="Times New Roman" w:eastAsia="Calibri" w:hAnsi="Times New Roman" w:cs="Times New Roman"/>
           <w:sz w:val="28"/>
           <w:szCs w:val="28"/>
-          <w:highlight w:val="yellow"/>
-        </w:rPr>
-        <w:t xml:space="preserve">[Город]</w:t>
-      </w:r>
-      <w:r>
-        <w:rPr>
+        </w:rPr>
+      </w:pPr>
+    </w:p>
+    <w:p>
+      <w:pPr>
+        <w:spacing w:after="160" w:line="259" w:lineRule="auto"/>
+        <w:rPr>
+          <w:rFonts w:ascii="Times New Roman" w:eastAsia="Calibri" w:hAnsi="Times New Roman" w:cs="Times New Roman"/>
           <w:sz w:val="28"/>
           <w:szCs w:val="28"/>
         </w:rPr>
-        <w:t xml:space="preserve"> 2026</w:t>
+      </w:pPr>
+    </w:p>
+    <w:p>
+      <w:pPr>
+        <w:spacing w:after="160" w:line="259" w:lineRule="auto"/>
+        <w:rPr>
+          <w:rFonts w:ascii="Times New Roman" w:eastAsia="Calibri" w:hAnsi="Times New Roman" w:cs="Times New Roman"/>
+          <w:sz w:val="28"/>
+          <w:szCs w:val="28"/>
+        </w:rPr>
+      </w:pPr>
+    </w:p>
+    <w:p>
+      <w:pPr>
+        <w:spacing w:after="160" w:line="259" w:lineRule="auto"/>
+        <w:rPr>
+          <w:rFonts w:ascii="Times New Roman" w:eastAsia="Calibri" w:hAnsi="Times New Roman" w:cs="Times New Roman"/>
+          <w:sz w:val="28"/>
+          <w:szCs w:val="28"/>
+        </w:rPr>
+      </w:pPr>
+    </w:p>
+    <w:p>
+      <w:pPr>
+        <w:spacing w:after="160" w:line="259" w:lineRule="auto"/>
+        <w:rPr>
+          <w:rFonts w:ascii="Times New Roman" w:eastAsia="Calibri" w:hAnsi="Times New Roman" w:cs="Times New Roman"/>
+          <w:sz w:val="28"/>
+          <w:szCs w:val="28"/>
+        </w:rPr>
+      </w:pPr>
+    </w:p>
+    <w:p>
+      <w:pPr>
+        <w:spacing w:after="160" w:line="259" w:lineRule="auto"/>
+        <w:jc w:val="center"/>
+      </w:pPr>
+      <w:r>
+        <w:rPr>
+          <w:rFonts w:ascii="Times New Roman" w:eastAsia="Calibri" w:hAnsi="Times New Roman" w:cs="Times New Roman"/>
+          <w:sz w:val="28"/>
+          <w:szCs w:val="28"/>
+        </w:rPr>
+        <w:t>Новосибирск 20</w:t>
+      </w:r>
+      <w:r>
+        <w:rPr>
+          <w:rFonts w:ascii="Times New Roman" w:eastAsia="Calibri" w:hAnsi="Times New Roman" w:cs="Times New Roman"/>
+          <w:sz w:val="28"/>
+          <w:szCs w:val="28"/>
+        </w:rPr>
+        <w:t>26</w:t>
+      </w:r>
+      <w:r>
+        <w:rPr>
+          <w:rFonts w:ascii="Times New Roman" w:eastAsia="Calibri" w:hAnsi="Times New Roman" w:cs="Times New Roman"/>
+          <w:sz w:val="28"/>
+          <w:szCs w:val="28"/>
+        </w:rPr>
+        <w:t xml:space="preserve"> г.</w:t>
       </w:r>
     </w:p>
     <w:p>

</xml_diff>

<commit_message>
Remove the Figma link placeholder from the report
</commit_message>
<xml_diff>
--- a/docs/report/Отчёт по практике — Панов Д. С.docx
+++ b/docs/report/Отчёт по практике — Панов Д. С.docx
@@ -5240,25 +5240,6 @@
       </w:pPr>
       <w:r>
         <w:t xml:space="preserve">Интерфейс спроектирован для трёх ролей. Верхнее меню меняется в зависимости от роли: клиент видит каталог, свои заявки и кнопку «Сдать в ремонт», мастер – свои ремонты и склад, администратор – заявки, склад, услуги, сотрудников, клиентов и статистику. Карточка заявки общая для всех ролей, но набор действий в ней зависит от прав пользователя. Цветовая схема нейтральная с одним акцентным цветом; статусы обозначены цветными метками, этапы ремонта – шкалой прогресса.</w:t>
-      </w:r>
-    </w:p>
-    <w:p>
-      <w:pPr>
-        <w:spacing w:after="0" w:before="0" w:line="360"/>
-        <w:ind w:firstLine="709"/>
-        <w:jc w:val="both"/>
-      </w:pPr>
-      <w:r>
-        <w:t xml:space="preserve">Макеты интерфейса в Figma: </w:t>
-      </w:r>
-      <w:r>
-        <w:rPr>
-          <w:highlight w:val="yellow"/>
-        </w:rPr>
-        <w:t xml:space="preserve">[ссылка на макет Figma]</w:t>
-      </w:r>
-      <w:r>
-        <w:t xml:space="preserve">.</w:t>
       </w:r>
     </w:p>
     <w:p>

</xml_diff>

<commit_message>
Update report screenshots and text to the new design and test count
</commit_message>
<xml_diff>
--- a/docs/report/Отчёт по практике — Панов Д. С.docx
+++ b/docs/report/Отчёт по практике — Панов Д. С.docx
@@ -5239,7 +5239,7 @@
         <w:jc w:val="both"/>
       </w:pPr>
       <w:r>
-        <w:t xml:space="preserve">Интерфейс спроектирован для трёх ролей. Верхнее меню меняется в зависимости от роли: клиент видит каталог, свои заявки и кнопку «Сдать в ремонт», мастер – свои ремонты и склад, администратор – заявки, склад, услуги, сотрудников, клиентов и статистику. Карточка заявки общая для всех ролей, но набор действий в ней зависит от прав пользователя. Цветовая схема нейтральная с одним акцентным цветом; статусы обозначены цветными метками, этапы ремонта – шкалой прогресса.</w:t>
+        <w:t xml:space="preserve">Интерфейс спроектирован для трёх ролей. Верхнее меню меняется в зависимости от роли: клиент видит каталог, свои заявки и кнопку «Сдать в ремонт», мастер – свои ремонты и склад, администратор – заявки, склад, услуги, сотрудников, клиентов и статистику. Карточка заявки общая для всех ролей, но набор действий в ней зависит от прав пользователя. Образ – квитанция мастерской: тёплый фон, чёрные рамки, оранжевый акцент, статусы в виде штампов.</w:t>
       </w:r>
     </w:p>
     <w:p>
@@ -6982,7 +6982,7 @@
         <w:jc w:val="both"/>
       </w:pPr>
       <w:r>
-        <w:t xml:space="preserve">Для модулей написаны автоматические тесты на встроенном фреймворке django.test – всего 76 тестов (таблица 7). Тесты запускаются командой </w:t>
+        <w:t xml:space="preserve">Для модулей написаны автоматические тесты на встроенном фреймворке django.test – всего 81 тест (таблица 7). Тесты запускаются командой </w:t>
       </w:r>
       <w:r>
         <w:rPr>
@@ -9997,7 +9997,7 @@
         <w:jc w:val="both"/>
       </w:pPr>
       <w:r>
-        <w:t xml:space="preserve">написаны 76 автоматических тестов, проверены формы и граничные значения, время отклика страниц не превышает 40 мс на сервере;</w:t>
+        <w:t xml:space="preserve">написан 81 автоматический тест, проверены формы и граничные значения, время отклика страниц не превышает 40 мс на сервере;</w:t>
       </w:r>
     </w:p>
     <w:p>

</xml_diff>